<commit_message>
docs(research): integrate empirical AWS EC2 live deployment benchmarks into research papers, tables, and documentation
</commit_message>
<xml_diff>
--- a/research/full_research_paper.docx
+++ b/research/full_research_paper.docx
@@ -10352,7 +10352,7 @@
                 <w:rFonts w:ascii="Times New Roman" w:hAnsi="Times New Roman"/>
                 <w:sz w:val="19"/>
               </w:rPr>
-              <w:t>AWS EC2 (t3.medium Ubuntu)</w:t>
+              <w:t>AWS EC2 Cloud Node (t3.medium)</w:t>
             </w:r>
           </w:p>
         </w:tc>
@@ -10402,7 +10402,7 @@
                 <w:rFonts w:ascii="Times New Roman" w:hAnsi="Times New Roman"/>
                 <w:sz w:val="19"/>
               </w:rPr>
-              <w:t>0.18 ms</w:t>
+              <w:t>1.57 ms</w:t>
             </w:r>
           </w:p>
         </w:tc>
@@ -10427,7 +10427,7 @@
                 <w:rFonts w:ascii="Times New Roman" w:hAnsi="Times New Roman"/>
                 <w:sz w:val="19"/>
               </w:rPr>
-              <w:t>0.31 ms</w:t>
+              <w:t>1.71 ms</w:t>
             </w:r>
           </w:p>
         </w:tc>
@@ -10452,7 +10452,7 @@
                 <w:rFonts w:ascii="Times New Roman" w:hAnsi="Times New Roman"/>
                 <w:sz w:val="19"/>
               </w:rPr>
-              <w:t>180.20 MB</w:t>
+              <w:t>18.10 MB</w:t>
             </w:r>
           </w:p>
         </w:tc>
@@ -10477,7 +10477,7 @@
                 <w:rFonts w:ascii="Times New Roman" w:hAnsi="Times New Roman"/>
                 <w:sz w:val="19"/>
               </w:rPr>
-              <w:t>Cloud Managed</w:t>
+              <w:t>Cloud Managed (617 req/s)</w:t>
             </w:r>
           </w:p>
         </w:tc>

</xml_diff>